<commit_message>
added animations on the ccharacters
</commit_message>
<xml_diff>
--- a/docs/FLN_Game_Documentation.docx
+++ b/docs/FLN_Game_Documentation.docx
@@ -3009,6 +3009,31 @@
               <w:rPr>
                 <w:rStyle w:val="VerbatimChar"/>
               </w:rPr>
+              <w:t xml:space="preserve">lib/</w:t>
+            </w:r>
+          </w:p>
+        </w:tc>
+        <w:tc>
+          <w:tcPr/>
+          <w:p>
+            <w:pPr>
+              <w:pStyle w:val="Compact"/>
+            </w:pPr>
+          </w:p>
+        </w:tc>
+      </w:tr>
+      <w:tr>
+        <w:tc>
+          <w:tcPr/>
+          <w:p>
+            <w:pPr>
+              <w:pStyle w:val="Compact"/>
+              <w:jc w:val="left"/>
+            </w:pPr>
+            <w:r>
+              <w:rPr>
+                <w:rStyle w:val="VerbatimChar"/>
+              </w:rPr>
               <w:t xml:space="preserve">lib/main.dart</w:t>
             </w:r>
           </w:p>
@@ -3467,8 +3492,33 @@
               <w:jc w:val="left"/>
             </w:pPr>
             <w:r>
-              <w:t xml:space="preserve">visuals (object groups, answer buttons, stars), anim (PopIn, Shake, Pulse, CrossOut), celebration (confetti, praise card), sound_widgets (faces, figures, captions), trainer_picker, avatar, adult_gate</w:t>
-            </w:r>
+              <w:t xml:space="preserve">visuals (object groups, answer buttons, stars), anim (PopIn, Shake, Pulse, CrossOut), celebration (confetti, praise card), sound_widgets (faces, figures, captions), trainer_picker, trainer_actor (animated trainer), avatar, adult_gate</w:t>
+            </w:r>
+          </w:p>
+        </w:tc>
+      </w:tr>
+      <w:tr>
+        <w:tc>
+          <w:tcPr/>
+          <w:p>
+            <w:pPr>
+              <w:pStyle w:val="Compact"/>
+              <w:jc w:val="left"/>
+            </w:pPr>
+            <w:r>
+              <w:rPr>
+                <w:rStyle w:val="VerbatimChar"/>
+              </w:rPr>
+              <w:t xml:space="preserve">assets/</w:t>
+            </w:r>
+          </w:p>
+        </w:tc>
+        <w:tc>
+          <w:tcPr/>
+          <w:p>
+            <w:pPr>
+              <w:pStyle w:val="Compact"/>
+            </w:pPr>
           </w:p>
         </w:tc>
       </w:tr>
@@ -3699,7 +3749,7 @@
               <w:jc w:val="left"/>
             </w:pPr>
             <w:r>
-              <w:t xml:space="preserve">the short guides: DEVELOPER_GUIDE.md, LEVELS.md, DASHBOARDS.md, VOICES.md, voice_script.csv, brand/</w:t>
+              <w:t xml:space="preserve">this guide, LEVELS.md, DASHBOARDS.md, VOICES.md, voice_script.csv, brand/</w:t>
             </w:r>
           </w:p>
         </w:tc>
@@ -4936,7 +4986,7 @@
         <w:t xml:space="preserve"> </w:t>
       </w:r>
       <w:r>
-        <w:t xml:space="preserve">runs 28 tests (</w:t>
+        <w:t xml:space="preserve">runs 29 tests (</w:t>
       </w:r>
       <w:r>
         <w:rPr>
@@ -18132,7 +18182,7 @@
     </w:tbl>
     <w:bookmarkEnd w:id="51"/>
     <w:bookmarkEnd w:id="52"/>
-    <w:bookmarkStart w:id="56" w:name="animations"/>
+    <w:bookmarkStart w:id="57" w:name="animations"/>
     <w:p>
       <w:pPr>
         <w:pStyle w:val="Heading1"/>
@@ -18349,6 +18399,314 @@
       </w:r>
       <w:r>
         <w:t xml:space="preserve">a bigger confetti burst on the result screen, and the stars land one at a time, each with a twinkle.</w:t>
+      </w:r>
+    </w:p>
+    <w:bookmarkStart w:id="56" w:name="trainer-moves-v0.6"/>
+    <w:p>
+      <w:pPr>
+        <w:pStyle w:val="Heading3"/>
+      </w:pPr>
+      <w:r>
+        <w:t xml:space="preserve">Trainer moves (v0.6)</w:t>
+      </w:r>
+    </w:p>
+    <w:p>
+      <w:pPr>
+        <w:pStyle w:val="FirstParagraph"/>
+      </w:pPr>
+      <w:r>
+        <w:t xml:space="preserve">The trainer stands at the top of the map, play, placement and result screens (</w:t>
+      </w:r>
+      <w:r>
+        <w:rPr>
+          <w:rStyle w:val="VerbatimChar"/>
+        </w:rPr>
+        <w:t xml:space="preserve">TrainerStrip</w:t>
+      </w:r>
+      <w:r>
+        <w:t xml:space="preserve"> </w:t>
+      </w:r>
+      <w:r>
+        <w:t xml:space="preserve">in</w:t>
+      </w:r>
+      <w:r>
+        <w:t xml:space="preserve"> </w:t>
+      </w:r>
+      <w:r>
+        <w:rPr>
+          <w:rStyle w:val="VerbatimChar"/>
+        </w:rPr>
+        <w:t xml:space="preserve">lib/widgets/trainer_picker.dart</w:t>
+      </w:r>
+      <w:r>
+        <w:t xml:space="preserve">, drawing</w:t>
+      </w:r>
+      <w:r>
+        <w:t xml:space="preserve"> </w:t>
+      </w:r>
+      <w:r>
+        <w:rPr>
+          <w:rStyle w:val="VerbatimChar"/>
+        </w:rPr>
+        <w:t xml:space="preserve">TrainerActor</w:t>
+      </w:r>
+      <w:r>
+        <w:t xml:space="preserve"> </w:t>
+      </w:r>
+      <w:r>
+        <w:t xml:space="preserve">from</w:t>
+      </w:r>
+      <w:r>
+        <w:t xml:space="preserve"> </w:t>
+      </w:r>
+      <w:r>
+        <w:rPr>
+          <w:rStyle w:val="VerbatimChar"/>
+        </w:rPr>
+        <w:t xml:space="preserve">lib/widgets/trainer_actor.dart</w:t>
+      </w:r>
+      <w:r>
+        <w:t xml:space="preserve">). The coach sends a move with each line (</w:t>
+      </w:r>
+      <w:r>
+        <w:rPr>
+          <w:rStyle w:val="VerbatimChar"/>
+        </w:rPr>
+        <w:t xml:space="preserve">Coach.cue</w:t>
+      </w:r>
+      <w:r>
+        <w:t xml:space="preserve">):</w:t>
+      </w:r>
+    </w:p>
+    <w:tbl>
+      <w:tblPr>
+        <w:tblStyle w:val="Table"/>
+        <w:tblW w:type="pct" w:w="5000"/>
+        <w:tblLook w:firstRow="1" w:lastRow="0" w:firstColumn="0" w:lastColumn="0" w:noHBand="0" w:noVBand="0" w:val="0020"/>
+        <w:jc w:val="start"/>
+      </w:tblPr>
+      <w:tblGrid>
+        <w:gridCol w:w="3960"/>
+        <w:gridCol w:w="3960"/>
+      </w:tblGrid>
+      <w:tr>
+        <w:trPr>
+          <w:tblHeader w:val="true"/>
+        </w:trPr>
+        <w:tc>
+          <w:tcPr/>
+          <w:p>
+            <w:pPr>
+              <w:pStyle w:val="Compact"/>
+              <w:jc w:val="left"/>
+            </w:pPr>
+            <w:r>
+              <w:t xml:space="preserve">Event</w:t>
+            </w:r>
+          </w:p>
+        </w:tc>
+        <w:tc>
+          <w:tcPr/>
+          <w:p>
+            <w:pPr>
+              <w:pStyle w:val="Compact"/>
+              <w:jc w:val="left"/>
+            </w:pPr>
+            <w:r>
+              <w:t xml:space="preserve">Move</w:t>
+            </w:r>
+          </w:p>
+        </w:tc>
+      </w:tr>
+      <w:tr>
+        <w:tc>
+          <w:tcPr/>
+          <w:p>
+            <w:pPr>
+              <w:pStyle w:val="Compact"/>
+              <w:jc w:val="left"/>
+            </w:pPr>
+            <w:r>
+              <w:t xml:space="preserve">welcome, placement start, level start</w:t>
+            </w:r>
+          </w:p>
+        </w:tc>
+        <w:tc>
+          <w:tcPr/>
+          <w:p>
+            <w:pPr>
+              <w:pStyle w:val="Compact"/>
+              <w:jc w:val="left"/>
+            </w:pPr>
+            <w:r>
+              <w:t xml:space="preserve">wave (rocks side to side, 👋)</w:t>
+            </w:r>
+          </w:p>
+        </w:tc>
+      </w:tr>
+      <w:tr>
+        <w:tc>
+          <w:tcPr/>
+          <w:p>
+            <w:pPr>
+              <w:pStyle w:val="Compact"/>
+              <w:jc w:val="left"/>
+            </w:pPr>
+            <w:r>
+              <w:t xml:space="preserve">new question</w:t>
+            </w:r>
+          </w:p>
+        </w:tc>
+        <w:tc>
+          <w:tcPr/>
+          <w:p>
+            <w:pPr>
+              <w:pStyle w:val="Compact"/>
+              <w:jc w:val="left"/>
+            </w:pPr>
+            <w:r>
+              <w:t xml:space="preserve">hop</w:t>
+            </w:r>
+          </w:p>
+        </w:tc>
+      </w:tr>
+      <w:tr>
+        <w:tc>
+          <w:tcPr/>
+          <w:p>
+            <w:pPr>
+              <w:pStyle w:val="Compact"/>
+              <w:jc w:val="left"/>
+            </w:pPr>
+            <w:r>
+              <w:t xml:space="preserve">right answer</w:t>
+            </w:r>
+          </w:p>
+        </w:tc>
+        <w:tc>
+          <w:tcPr/>
+          <w:p>
+            <w:pPr>
+              <w:pStyle w:val="Compact"/>
+              <w:jc w:val="left"/>
+            </w:pPr>
+            <w:r>
+              <w:t xml:space="preserve">cheer (two jumps, ✨)</w:t>
+            </w:r>
+          </w:p>
+        </w:tc>
+      </w:tr>
+      <w:tr>
+        <w:tc>
+          <w:tcPr/>
+          <w:p>
+            <w:pPr>
+              <w:pStyle w:val="Compact"/>
+              <w:jc w:val="left"/>
+            </w:pPr>
+            <w:r>
+              <w:t xml:space="preserve">right after a mistake</w:t>
+            </w:r>
+          </w:p>
+        </w:tc>
+        <w:tc>
+          <w:tcPr/>
+          <w:p>
+            <w:pPr>
+              <w:pStyle w:val="Compact"/>
+              <w:jc w:val="left"/>
+            </w:pPr>
+            <w:r>
+              <w:t xml:space="preserve">jump (⭐)</w:t>
+            </w:r>
+          </w:p>
+        </w:tc>
+      </w:tr>
+      <w:tr>
+        <w:tc>
+          <w:tcPr/>
+          <w:p>
+            <w:pPr>
+              <w:pStyle w:val="Compact"/>
+              <w:jc w:val="left"/>
+            </w:pPr>
+            <w:r>
+              <w:t xml:space="preserve">first mistake</w:t>
+            </w:r>
+          </w:p>
+        </w:tc>
+        <w:tc>
+          <w:tcPr/>
+          <w:p>
+            <w:pPr>
+              <w:pStyle w:val="Compact"/>
+              <w:jc w:val="left"/>
+            </w:pPr>
+            <w:r>
+              <w:t xml:space="preserve">think (head tilt, ❓)</w:t>
+            </w:r>
+          </w:p>
+        </w:tc>
+      </w:tr>
+      <w:tr>
+        <w:tc>
+          <w:tcPr/>
+          <w:p>
+            <w:pPr>
+              <w:pStyle w:val="Compact"/>
+              <w:jc w:val="left"/>
+            </w:pPr>
+            <w:r>
+              <w:t xml:space="preserve">second mistake</w:t>
+            </w:r>
+          </w:p>
+        </w:tc>
+        <w:tc>
+          <w:tcPr/>
+          <w:p>
+            <w:pPr>
+              <w:pStyle w:val="Compact"/>
+              <w:jc w:val="left"/>
+            </w:pPr>
+            <w:r>
+              <w:t xml:space="preserve">nod (👍)</w:t>
+            </w:r>
+          </w:p>
+        </w:tc>
+      </w:tr>
+      <w:tr>
+        <w:tc>
+          <w:tcPr/>
+          <w:p>
+            <w:pPr>
+              <w:pStyle w:val="Compact"/>
+              <w:jc w:val="left"/>
+            </w:pPr>
+            <w:r>
+              <w:t xml:space="preserve">level end</w:t>
+            </w:r>
+          </w:p>
+        </w:tc>
+        <w:tc>
+          <w:tcPr/>
+          <w:p>
+            <w:pPr>
+              <w:pStyle w:val="Compact"/>
+              <w:jc w:val="left"/>
+            </w:pPr>
+            <w:r>
+              <w:t xml:space="preserve">cheer if passed, nod if not</w:t>
+            </w:r>
+          </w:p>
+        </w:tc>
+      </w:tr>
+    </w:tbl>
+    <w:p>
+      <w:pPr>
+        <w:pStyle w:val="BodyText"/>
+      </w:pPr>
+      <w:r>
+        <w:t xml:space="preserve">While idle they breathe and sway; while the voice is speaking they bob. Tapping them makes them jump. Each picture is one flat cut-out, so the whole body moves. Real arm and leg movement needs the art split into parts, or a rigged character made in a tool such as Rive.</w:t>
       </w:r>
     </w:p>
     <w:p>
@@ -18524,7 +18882,8 @@
       </w:r>
     </w:p>
     <w:bookmarkEnd w:id="56"/>
-    <w:bookmarkStart w:id="60" w:name="dashboards"/>
+    <w:bookmarkEnd w:id="57"/>
+    <w:bookmarkStart w:id="61" w:name="dashboards"/>
     <w:p>
       <w:pPr>
         <w:pStyle w:val="Heading1"/>
@@ -18568,7 +18927,7 @@
         <w:t xml:space="preserve">); nothing is sent anywhere.</w:t>
       </w:r>
     </w:p>
-    <w:bookmarkStart w:id="57" w:name="Xf19464ebfaae9dbd60d80ddb24a7c7e659af09f"/>
+    <w:bookmarkStart w:id="58" w:name="Xf19464ebfaae9dbd60d80ddb24a7c7e659af09f"/>
     <w:p>
       <w:pPr>
         <w:pStyle w:val="Heading2"/>
@@ -18824,8 +19183,8 @@
         </w:tc>
       </w:tr>
     </w:tbl>
-    <w:bookmarkEnd w:id="57"/>
-    <w:bookmarkStart w:id="58" w:name="X588414c1c9b83d64f36824631c6c3679a965a14"/>
+    <w:bookmarkEnd w:id="58"/>
+    <w:bookmarkStart w:id="59" w:name="X588414c1c9b83d64f36824631c6c3679a965a14"/>
     <w:p>
       <w:pPr>
         <w:pStyle w:val="Heading2"/>
@@ -19151,8 +19510,8 @@
         <w:t xml:space="preserve">).</w:t>
       </w:r>
     </w:p>
-    <w:bookmarkEnd w:id="58"/>
-    <w:bookmarkStart w:id="59" w:name="next-not-built-yet"/>
+    <w:bookmarkEnd w:id="59"/>
+    <w:bookmarkStart w:id="60" w:name="next-not-built-yet"/>
     <w:p>
       <w:pPr>
         <w:pStyle w:val="Heading2"/>
@@ -19265,9 +19624,9 @@
         <w:t xml:space="preserve">: re-run the placement check after a few weeks and show the change.</w:t>
       </w:r>
     </w:p>
-    <w:bookmarkEnd w:id="59"/>
     <w:bookmarkEnd w:id="60"/>
-    <w:bookmarkStart w:id="64" w:name="brand"/>
+    <w:bookmarkEnd w:id="61"/>
+    <w:bookmarkStart w:id="65" w:name="brand"/>
     <w:p>
       <w:pPr>
         <w:pStyle w:val="Heading1"/>
@@ -19429,18 +19788,18 @@
           <wp:inline>
             <wp:extent cx="3200400" cy="1120140"/>
             <wp:effectExtent b="0" l="0" r="0" t="0"/>
-            <wp:docPr descr="App icon and name" title="" id="62" name="Picture"/>
+            <wp:docPr descr="App icon and name" title="" id="63" name="Picture"/>
             <a:graphic>
               <a:graphicData uri="http://schemas.openxmlformats.org/drawingml/2006/picture">
                 <pic:pic>
                   <pic:nvPicPr>
-                    <pic:cNvPr descr="lockup.png" id="63" name="Picture"/>
+                    <pic:cNvPr descr="lockup.png" id="64" name="Picture"/>
                     <pic:cNvPicPr>
                       <a:picLocks noChangeArrowheads="1" noChangeAspect="1"/>
                     </pic:cNvPicPr>
                   </pic:nvPicPr>
                   <pic:blipFill>
-                    <a:blip r:embed="rId61"/>
+                    <a:blip r:embed="rId62"/>
                     <a:stretch>
                       <a:fillRect/>
                     </a:stretch>
@@ -19475,8 +19834,8 @@
         <w:t xml:space="preserve">App icon and name</w:t>
       </w:r>
     </w:p>
-    <w:bookmarkEnd w:id="64"/>
-    <w:bookmarkStart w:id="65" w:name="open-decisions-and-next-steps"/>
+    <w:bookmarkEnd w:id="65"/>
+    <w:bookmarkStart w:id="66" w:name="open-decisions-and-next-steps"/>
     <w:p>
       <w:pPr>
         <w:pStyle w:val="Heading1"/>
@@ -19705,8 +20064,8 @@
         <w:t xml:space="preserve">Later, if wanted: teacher sync across devices, which needs a server and parental consent rules.</w:t>
       </w:r>
     </w:p>
-    <w:bookmarkEnd w:id="65"/>
-    <w:bookmarkStart w:id="66" w:name="where-everything-lives"/>
+    <w:bookmarkEnd w:id="66"/>
+    <w:bookmarkStart w:id="67" w:name="where-everything-lives"/>
     <w:p>
       <w:pPr>
         <w:pStyle w:val="Heading1"/>
@@ -20108,8 +20467,8 @@
         </w:tc>
       </w:tr>
     </w:tbl>
-    <w:bookmarkEnd w:id="66"/>
-    <w:bookmarkStart w:id="74" w:name="version-history"/>
+    <w:bookmarkEnd w:id="67"/>
+    <w:bookmarkStart w:id="75" w:name="version-history"/>
     <w:p>
       <w:pPr>
         <w:pStyle w:val="Heading1"/>
@@ -20118,24 +20477,6 @@
         <w:t xml:space="preserve">12. Version history</w:t>
       </w:r>
     </w:p>
-    <w:bookmarkStart w:id="67" w:name="version-0.2"/>
-    <w:p>
-      <w:pPr>
-        <w:pStyle w:val="Heading2"/>
-      </w:pPr>
-      <w:r>
-        <w:t xml:space="preserve">Version 0.2</w:t>
-      </w:r>
-    </w:p>
-    <w:p>
-      <w:pPr>
-        <w:pStyle w:val="FirstParagraph"/>
-      </w:pPr>
-      <w:r>
-        <w:t xml:space="preserve">Picture sign-in and guest play, placement check, level paths, stars, 14 achievements, child and teacher dashboards, and the black background fix. v0.1 progress is not carried over.</w:t>
-      </w:r>
-    </w:p>
-    <w:bookmarkEnd w:id="67"/>
     <w:bookmarkStart w:id="68" w:name="version-0.2.1-brand"/>
     <w:p>
       <w:pPr>
@@ -20597,13 +20938,13 @@
       </w:r>
     </w:p>
     <w:bookmarkEnd w:id="72"/>
-    <w:bookmarkStart w:id="73" w:name="version-0.6-trainers"/>
+    <w:bookmarkStart w:id="73" w:name="version-0.6"/>
     <w:p>
       <w:pPr>
         <w:pStyle w:val="Heading2"/>
       </w:pPr>
       <w:r>
-        <w:t xml:space="preserve">Version 0.6: trainers</w:t>
+        <w:t xml:space="preserve">Version 0.6</w:t>
       </w:r>
     </w:p>
     <w:p>
@@ -20654,8 +20995,80 @@
         <w:t xml:space="preserve">Voice pack: trainers share a boy set and a girl set of clips, so the recording script is now 744 clips (372 each).</w:t>
       </w:r>
     </w:p>
+    <w:p>
+      <w:pPr>
+        <w:numPr>
+          <w:ilvl w:val="0"/>
+          <w:numId w:val="1033"/>
+        </w:numPr>
+        <w:pStyle w:val="Compact"/>
+      </w:pPr>
+      <w:r>
+        <w:t xml:space="preserve">The trainer is alive on the map, play, placement and result screens. They breathe and sway while idle, bob while talking, and act out the game: wave hello, hop for each new question, cheer (two jumps and sparkles) for a right answer, jump with a star after a retry, tilt their head with a</w:t>
+      </w:r>
+      <w:r>
+        <w:t xml:space="preserve"> </w:t>
+      </w:r>
+      <w:r>
+        <w:t xml:space="preserve">“</w:t>
+      </w:r>
+      <w:r>
+        <w:t xml:space="preserve">?</w:t>
+      </w:r>
+      <w:r>
+        <w:t xml:space="preserve">”</w:t>
+      </w:r>
+      <w:r>
+        <w:t xml:space="preserve"> </w:t>
+      </w:r>
+      <w:r>
+        <w:t xml:space="preserve">after a mistake, and nod with a thumbs-up to encourage. Tap them and they jump. Code:</w:t>
+      </w:r>
+      <w:r>
+        <w:t xml:space="preserve"> </w:t>
+      </w:r>
+      <w:r>
+        <w:rPr>
+          <w:rStyle w:val="VerbatimChar"/>
+        </w:rPr>
+        <w:t xml:space="preserve">lib/widgets/trainer_actor.dart</w:t>
+      </w:r>
+      <w:r>
+        <w:t xml:space="preserve">; the moves are picked in</w:t>
+      </w:r>
+      <w:r>
+        <w:t xml:space="preserve"> </w:t>
+      </w:r>
+      <w:r>
+        <w:rPr>
+          <w:rStyle w:val="VerbatimChar"/>
+        </w:rPr>
+        <w:t xml:space="preserve">lib/audio/coach.dart</w:t>
+      </w:r>
+      <w:r>
+        <w:t xml:space="preserve">.</w:t>
+      </w:r>
+    </w:p>
     <w:bookmarkEnd w:id="73"/>
+    <w:bookmarkStart w:id="74" w:name="version-0.2"/>
+    <w:p>
+      <w:pPr>
+        <w:pStyle w:val="Heading2"/>
+      </w:pPr>
+      <w:r>
+        <w:t xml:space="preserve">Version 0.2</w:t>
+      </w:r>
+    </w:p>
+    <w:p>
+      <w:pPr>
+        <w:pStyle w:val="FirstParagraph"/>
+      </w:pPr>
+      <w:r>
+        <w:t xml:space="preserve">Picture sign-in and guest play, placement check, level paths, stars, 14 achievements, child and teacher dashboards, and the black background fix. v0.1 progress is not carried over.</w:t>
+      </w:r>
+    </w:p>
     <w:bookmarkEnd w:id="74"/>
+    <w:bookmarkEnd w:id="75"/>
     <w:sectPr/>
   </w:body>
 </w:document>

</xml_diff>